<commit_message>
All Power Labs Doc
</commit_message>
<xml_diff>
--- a/Uni_Courses/Third_Year/Power Electronics 3/Borkovec 2941124B Lab 2 Single Phase Transformer.docx
+++ b/Uni_Courses/Third_Year/Power Electronics 3/Borkovec 2941124B Lab 2 Single Phase Transformer.docx
@@ -8,12 +8,6 @@
           <w:rFonts w:ascii="Arial" w:hAnsi="Arial" w:cs="Arial"/>
         </w:rPr>
       </w:pPr>
-      <w:r>
-        <w:rPr>
-          <w:rFonts w:ascii="Arial" w:hAnsi="Arial" w:cs="Arial"/>
-        </w:rPr>
-        <w:t>k</w:t>
-      </w:r>
     </w:p>
     <w:p>
       <w:pPr>
@@ -280,10 +274,34 @@
         <w:jc w:val="both"/>
       </w:pPr>
       <w:r>
-        <w:t xml:space="preserve">Transformers are one of the principle reasons why we have AC Power Networks as opposed to DC systems. </w:t>
-      </w:r>
-      <w:r>
-        <w:t>Their ability to provide a (relatively!) cheap and reliable means of converting AC voltage levels results in high efficiency AC power transmission. In this series of experiments you will investigate the main features of a small single phase transformer, and by the end of the laboratory you should have a good understanding of the following:</w:t>
+        <w:t xml:space="preserve">Transformers are one of the </w:t>
+      </w:r>
+      <w:proofErr w:type="gramStart"/>
+      <w:r>
+        <w:t>principle</w:t>
+      </w:r>
+      <w:proofErr w:type="gramEnd"/>
+      <w:r>
+        <w:t xml:space="preserve"> reasons why we have AC Power Networks as opposed to DC systems. </w:t>
+      </w:r>
+      <w:r>
+        <w:t xml:space="preserve">Their ability to provide a (relatively!) cheap and reliable means of converting AC voltage levels results in high efficiency AC power transmission. In this series of </w:t>
+      </w:r>
+      <w:proofErr w:type="gramStart"/>
+      <w:r>
+        <w:t>experiments</w:t>
+      </w:r>
+      <w:proofErr w:type="gramEnd"/>
+      <w:r>
+        <w:t xml:space="preserve"> you will investigate the main features of a small </w:t>
+      </w:r>
+      <w:proofErr w:type="gramStart"/>
+      <w:r>
+        <w:t>single phase</w:t>
+      </w:r>
+      <w:proofErr w:type="gramEnd"/>
+      <w:r>
+        <w:t xml:space="preserve"> transformer, and by the end of the laboratory you should have a good understanding of the following:</w:t>
       </w:r>
     </w:p>
     <w:p>
@@ -324,7 +342,15 @@
         <w:jc w:val="both"/>
       </w:pPr>
       <w:r>
-        <w:t>The equivalent circuit for a practical single phase transformer</w:t>
+        <w:t xml:space="preserve">The equivalent circuit for a practical </w:t>
+      </w:r>
+      <w:proofErr w:type="gramStart"/>
+      <w:r>
+        <w:t>single phase</w:t>
+      </w:r>
+      <w:proofErr w:type="gramEnd"/>
+      <w:r>
+        <w:t xml:space="preserve"> transformer</w:t>
       </w:r>
     </w:p>
     <w:p>
@@ -434,7 +460,15 @@
         <w:jc w:val="both"/>
       </w:pPr>
       <w:r>
-        <w:t xml:space="preserve">At some point after the lab session you need to write up the results (neatly!) and complete the associated analysis/theory sections before handing in your lab books before the end of the semester. </w:t>
+        <w:t xml:space="preserve">At some point after the lab </w:t>
+      </w:r>
+      <w:proofErr w:type="gramStart"/>
+      <w:r>
+        <w:t>session</w:t>
+      </w:r>
+      <w:proofErr w:type="gramEnd"/>
+      <w:r>
+        <w:t xml:space="preserve"> you need to write up the results (neatly!) and complete the associated analysis/theory sections before handing in your lab books before the end of the semester. </w:t>
       </w:r>
     </w:p>
     <w:p>
@@ -612,9 +646,9 @@
             <o:lock v:ext="edit" aspectratio="t"/>
           </v:shapetype>
           <v:shape id="_x0000_s1037" type="#_x0000_t75" alt="" style="position:absolute;left:0;text-align:left;margin-left:255.6pt;margin-top:3.55pt;width:90pt;height:66.5pt;z-index:251657216;mso-wrap-edited:f;mso-width-percent:0;mso-height-percent:0;mso-width-percent:0;mso-height-percent:0">
-            <v:imagedata r:id="rId5" o:title=""/>
+            <v:imagedata r:id="rId7" o:title=""/>
           </v:shape>
-          <o:OLEObject Type="Embed" ProgID="Equation.DSMT4" ShapeID="_x0000_s1037" DrawAspect="Content" ObjectID="_1837762179" r:id="rId6"/>
+          <o:OLEObject Type="Embed" ProgID="Equation.DSMT4" ShapeID="_x0000_s1037" DrawAspect="Content" ObjectID="_1837763695" r:id="rId8"/>
         </w:object>
       </w:r>
       <w:r>
@@ -624,9 +658,9 @@
         </w:rPr>
         <w:object w:dxaOrig="1440" w:dyaOrig="1440" w14:anchorId="05C717CD">
           <v:shape id="_x0000_s1036" type="#_x0000_t75" alt="" style="position:absolute;left:0;text-align:left;margin-left:111.6pt;margin-top:3.55pt;width:90pt;height:63.45pt;z-index:251656192;mso-wrap-edited:f;mso-width-percent:0;mso-height-percent:0;mso-width-percent:0;mso-height-percent:0">
-            <v:imagedata r:id="rId7" o:title=""/>
+            <v:imagedata r:id="rId9" o:title=""/>
           </v:shape>
-          <o:OLEObject Type="Embed" ProgID="Equation.DSMT4" ShapeID="_x0000_s1036" DrawAspect="Content" ObjectID="_1837762180" r:id="rId8"/>
+          <o:OLEObject Type="Embed" ProgID="Equation.DSMT4" ShapeID="_x0000_s1036" DrawAspect="Content" ObjectID="_1837763696" r:id="rId10"/>
         </w:object>
       </w:r>
     </w:p>
@@ -726,7 +760,7 @@
                     </pic:cNvPicPr>
                   </pic:nvPicPr>
                   <pic:blipFill>
-                    <a:blip r:embed="rId9" cstate="print">
+                    <a:blip r:embed="rId11" cstate="print">
                       <a:extLst>
                         <a:ext uri="{28A0092B-C50C-407E-A947-70E740481C1C}">
                           <a14:useLocalDpi xmlns:a14="http://schemas.microsoft.com/office/drawing/2010/main" val="0"/>
@@ -994,11 +1028,19 @@
         </w:rPr>
         <w:t xml:space="preserve">fully </w:t>
       </w:r>
-      <w:r>
-        <w:rPr>
-          <w:rFonts w:ascii="Arial" w:hAnsi="Arial" w:cs="Arial"/>
-        </w:rPr>
-        <w:t>counter-clockwise until it hits the end-stop).</w:t>
+      <w:proofErr w:type="gramStart"/>
+      <w:r>
+        <w:rPr>
+          <w:rFonts w:ascii="Arial" w:hAnsi="Arial" w:cs="Arial"/>
+        </w:rPr>
+        <w:t>counter-clockwise</w:t>
+      </w:r>
+      <w:proofErr w:type="gramEnd"/>
+      <w:r>
+        <w:rPr>
+          <w:rFonts w:ascii="Arial" w:hAnsi="Arial" w:cs="Arial"/>
+        </w:rPr>
+        <w:t xml:space="preserve"> until it hits the end-stop).</w:t>
       </w:r>
     </w:p>
     <w:p>
@@ -1467,7 +1509,7 @@
                     </pic:cNvPicPr>
                   </pic:nvPicPr>
                   <pic:blipFill>
-                    <a:blip r:embed="rId10" cstate="print">
+                    <a:blip r:embed="rId12" cstate="print">
                       <a:extLst>
                         <a:ext uri="{28A0092B-C50C-407E-A947-70E740481C1C}">
                           <a14:useLocalDpi xmlns:a14="http://schemas.microsoft.com/office/drawing/2010/main" val="0"/>
@@ -2146,7 +2188,15 @@
         <w:t>equivalent circuit whi</w:t>
       </w:r>
       <w:r>
-        <w:t xml:space="preserve">ch takes into account </w:t>
+        <w:t xml:space="preserve">ch </w:t>
+      </w:r>
+      <w:proofErr w:type="gramStart"/>
+      <w:r>
+        <w:t>takes into account</w:t>
+      </w:r>
+      <w:proofErr w:type="gramEnd"/>
+      <w:r>
+        <w:t xml:space="preserve"> </w:t>
       </w:r>
       <w:r>
         <w:t xml:space="preserve">issues such as wiring copper loss, leakage inductance, magnetising current and iron loss. The complete equivalent circuit </w:t>
@@ -2195,7 +2245,7 @@
                     </pic:cNvPicPr>
                   </pic:nvPicPr>
                   <pic:blipFill>
-                    <a:blip r:embed="rId11" cstate="print">
+                    <a:blip r:embed="rId13" cstate="print">
                       <a:extLst>
                         <a:ext uri="{28A0092B-C50C-407E-A947-70E740481C1C}">
                           <a14:useLocalDpi xmlns:a14="http://schemas.microsoft.com/office/drawing/2010/main" val="0"/>
@@ -2472,7 +2522,7 @@
                     </pic:cNvPicPr>
                   </pic:nvPicPr>
                   <pic:blipFill>
-                    <a:blip r:embed="rId12" cstate="print">
+                    <a:blip r:embed="rId14" cstate="print">
                       <a:extLst>
                         <a:ext uri="{28A0092B-C50C-407E-A947-70E740481C1C}">
                           <a14:useLocalDpi xmlns:a14="http://schemas.microsoft.com/office/drawing/2010/main" val="0"/>
@@ -2717,9 +2767,9 @@
               </w:rPr>
               <w:object w:dxaOrig="1440" w:dyaOrig="1440" w14:anchorId="482D106B">
                 <v:shape id="_x0000_s1035" type="#_x0000_t75" alt="" style="position:absolute;left:0;text-align:left;margin-left:7.2pt;margin-top:12.3pt;width:81.5pt;height:58.55pt;z-index:251658240;mso-wrap-edited:f;mso-width-percent:0;mso-height-percent:0;mso-position-horizontal-relative:text;mso-position-vertical-relative:text;mso-width-percent:0;mso-height-percent:0">
-                  <v:imagedata r:id="rId13" o:title=""/>
+                  <v:imagedata r:id="rId15" o:title=""/>
                 </v:shape>
-                <o:OLEObject Type="Embed" ProgID="Equation.DSMT4" ShapeID="_x0000_s1035" DrawAspect="Content" ObjectID="_1837762181" r:id="rId14"/>
+                <o:OLEObject Type="Embed" ProgID="Equation.DSMT4" ShapeID="_x0000_s1035" DrawAspect="Content" ObjectID="_1837763697" r:id="rId16"/>
               </w:object>
             </w:r>
             <w:r>
@@ -2921,9 +2971,9 @@
               </w:rPr>
               <w:object w:dxaOrig="1440" w:dyaOrig="1440" w14:anchorId="73548E18">
                 <v:shape id="_x0000_s1034" type="#_x0000_t75" alt="" style="position:absolute;left:0;text-align:left;margin-left:8.4pt;margin-top:14.65pt;width:90.3pt;height:26.25pt;z-index:251659264;mso-wrap-edited:f;mso-width-percent:0;mso-height-percent:0;mso-position-horizontal-relative:text;mso-position-vertical-relative:text;mso-width-percent:0;mso-height-percent:0">
-                  <v:imagedata r:id="rId15" o:title=""/>
+                  <v:imagedata r:id="rId17" o:title=""/>
                 </v:shape>
-                <o:OLEObject Type="Embed" ProgID="Equation.DSMT4" ShapeID="_x0000_s1034" DrawAspect="Content" ObjectID="_1837762182" r:id="rId16"/>
+                <o:OLEObject Type="Embed" ProgID="Equation.DSMT4" ShapeID="_x0000_s1034" DrawAspect="Content" ObjectID="_1837763698" r:id="rId18"/>
               </w:object>
             </w:r>
           </w:p>
@@ -2976,12 +3026,14 @@
                 <w:rFonts w:ascii="Arial" w:hAnsi="Arial" w:cs="Arial"/>
               </w:rPr>
             </w:pPr>
+            <w:proofErr w:type="spellStart"/>
             <w:r>
               <w:rPr>
                 <w:rFonts w:ascii="Arial" w:hAnsi="Arial" w:cs="Arial"/>
               </w:rPr>
               <w:t>VAr</w:t>
             </w:r>
+            <w:proofErr w:type="spellEnd"/>
           </w:p>
         </w:tc>
         <w:tc>
@@ -3002,9 +3054,9 @@
               </w:rPr>
               <w:object w:dxaOrig="1440" w:dyaOrig="1440" w14:anchorId="67518D64">
                 <v:shape id="_x0000_s1033" type="#_x0000_t75" alt="" style="position:absolute;left:0;text-align:left;margin-left:7.2pt;margin-top:3.95pt;width:171.15pt;height:48.9pt;z-index:251660288;mso-wrap-edited:f;mso-width-percent:0;mso-height-percent:0;mso-position-horizontal-relative:text;mso-position-vertical-relative:text;mso-width-percent:0;mso-height-percent:0">
-                  <v:imagedata r:id="rId17" o:title=""/>
+                  <v:imagedata r:id="rId19" o:title=""/>
                 </v:shape>
-                <o:OLEObject Type="Embed" ProgID="Equation.DSMT4" ShapeID="_x0000_s1033" DrawAspect="Content" ObjectID="_1837762183" r:id="rId18"/>
+                <o:OLEObject Type="Embed" ProgID="Equation.DSMT4" ShapeID="_x0000_s1033" DrawAspect="Content" ObjectID="_1837763699" r:id="rId20"/>
               </w:object>
             </w:r>
           </w:p>
@@ -3081,12 +3133,14 @@
                 <w:rFonts w:ascii="Arial" w:hAnsi="Arial" w:cs="Arial"/>
               </w:rPr>
             </w:pPr>
+            <w:proofErr w:type="spellStart"/>
             <w:r>
               <w:rPr>
                 <w:rFonts w:ascii="Arial" w:hAnsi="Arial" w:cs="Arial"/>
               </w:rPr>
               <w:t>VAr</w:t>
             </w:r>
+            <w:proofErr w:type="spellEnd"/>
           </w:p>
         </w:tc>
         <w:tc>
@@ -3108,9 +3162,9 @@
               </w:rPr>
               <w:object w:dxaOrig="1440" w:dyaOrig="1440" w14:anchorId="1A8D7B62">
                 <v:shape id="_x0000_s1032" type="#_x0000_t75" alt="" style="position:absolute;left:0;text-align:left;margin-left:7.2pt;margin-top:2.25pt;width:81.5pt;height:58.55pt;z-index:251661312;mso-wrap-edited:f;mso-width-percent:0;mso-height-percent:0;mso-position-horizontal-relative:text;mso-position-vertical-relative:text;mso-width-percent:0;mso-height-percent:0">
-                  <v:imagedata r:id="rId19" o:title=""/>
+                  <v:imagedata r:id="rId21" o:title=""/>
                 </v:shape>
-                <o:OLEObject Type="Embed" ProgID="Equation.DSMT4" ShapeID="_x0000_s1032" DrawAspect="Content" ObjectID="_1837762184" r:id="rId20"/>
+                <o:OLEObject Type="Embed" ProgID="Equation.DSMT4" ShapeID="_x0000_s1032" DrawAspect="Content" ObjectID="_1837763700" r:id="rId22"/>
               </w:object>
             </w:r>
           </w:p>
@@ -3643,7 +3697,25 @@
           <w:sz w:val="20"/>
           <w:szCs w:val="20"/>
         </w:rPr>
-        <w:t xml:space="preserve">Note: the Power Meter current and power values may be in milliamps </w:t>
+        <w:t xml:space="preserve">Note: </w:t>
+      </w:r>
+      <w:proofErr w:type="gramStart"/>
+      <w:r>
+        <w:rPr>
+          <w:rFonts w:ascii="Arial" w:hAnsi="Arial" w:cs="Arial"/>
+          <w:sz w:val="20"/>
+          <w:szCs w:val="20"/>
+        </w:rPr>
+        <w:t>the</w:t>
+      </w:r>
+      <w:proofErr w:type="gramEnd"/>
+      <w:r>
+        <w:rPr>
+          <w:rFonts w:ascii="Arial" w:hAnsi="Arial" w:cs="Arial"/>
+          <w:sz w:val="20"/>
+          <w:szCs w:val="20"/>
+        </w:rPr>
+        <w:t xml:space="preserve"> Power Meter current and power values may be in milliamps </w:t>
       </w:r>
       <w:r>
         <w:rPr>
@@ -4367,7 +4439,7 @@
                     </pic:cNvPicPr>
                   </pic:nvPicPr>
                   <pic:blipFill>
-                    <a:blip r:embed="rId21" cstate="print">
+                    <a:blip r:embed="rId23" cstate="print">
                       <a:extLst>
                         <a:ext uri="{28A0092B-C50C-407E-A947-70E740481C1C}">
                           <a14:useLocalDpi xmlns:a14="http://schemas.microsoft.com/office/drawing/2010/main" val="0"/>
@@ -4437,7 +4509,15 @@
         <w:jc w:val="both"/>
       </w:pPr>
       <w:r>
-        <w:t>Once again we have one resistive component (R</w:t>
+        <w:t xml:space="preserve">Once </w:t>
+      </w:r>
+      <w:proofErr w:type="gramStart"/>
+      <w:r>
+        <w:t>again</w:t>
+      </w:r>
+      <w:proofErr w:type="gramEnd"/>
+      <w:r>
+        <w:t xml:space="preserve"> we have one resistive component (R</w:t>
       </w:r>
       <w:r>
         <w:rPr>
@@ -4670,9 +4750,9 @@
               </w:rPr>
               <w:object w:dxaOrig="1440" w:dyaOrig="1440" w14:anchorId="11FE8604">
                 <v:shape id="_x0000_s1031" type="#_x0000_t75" alt="" style="position:absolute;left:0;text-align:left;margin-left:10.8pt;margin-top:1.2pt;width:117.1pt;height:32.15pt;z-index:251652096;mso-wrap-edited:f;mso-width-percent:0;mso-height-percent:0;mso-width-percent:0;mso-height-percent:0">
-                  <v:imagedata r:id="rId22" o:title=""/>
+                  <v:imagedata r:id="rId24" o:title=""/>
                 </v:shape>
-                <o:OLEObject Type="Embed" ProgID="Equation.DSMT4" ShapeID="_x0000_s1031" DrawAspect="Content" ObjectID="_1837762185" r:id="rId23"/>
+                <o:OLEObject Type="Embed" ProgID="Equation.DSMT4" ShapeID="_x0000_s1031" DrawAspect="Content" ObjectID="_1837763701" r:id="rId25"/>
               </w:object>
             </w:r>
           </w:p>
@@ -4791,9 +4871,9 @@
               </w:rPr>
               <w:object w:dxaOrig="1440" w:dyaOrig="1440" w14:anchorId="2B6DA988">
                 <v:shape id="_x0000_s1030" type="#_x0000_t75" alt="" style="position:absolute;left:0;text-align:left;margin-left:10.8pt;margin-top:8.5pt;width:90.3pt;height:26.25pt;z-index:251653120;mso-wrap-edited:f;mso-width-percent:0;mso-height-percent:0;mso-position-horizontal-relative:text;mso-position-vertical-relative:text;mso-width-percent:0;mso-height-percent:0">
-                  <v:imagedata r:id="rId24" o:title=""/>
+                  <v:imagedata r:id="rId26" o:title=""/>
                 </v:shape>
-                <o:OLEObject Type="Embed" ProgID="Equation.DSMT4" ShapeID="_x0000_s1030" DrawAspect="Content" ObjectID="_1837762186" r:id="rId25"/>
+                <o:OLEObject Type="Embed" ProgID="Equation.DSMT4" ShapeID="_x0000_s1030" DrawAspect="Content" ObjectID="_1837763702" r:id="rId27"/>
               </w:object>
             </w:r>
           </w:p>
@@ -4846,12 +4926,14 @@
                 <w:rFonts w:ascii="Arial" w:hAnsi="Arial" w:cs="Arial"/>
               </w:rPr>
             </w:pPr>
+            <w:proofErr w:type="spellStart"/>
             <w:r>
               <w:rPr>
                 <w:rFonts w:ascii="Arial" w:hAnsi="Arial" w:cs="Arial"/>
               </w:rPr>
               <w:t>VAr</w:t>
             </w:r>
+            <w:proofErr w:type="spellEnd"/>
           </w:p>
         </w:tc>
         <w:tc>
@@ -4872,9 +4954,9 @@
               </w:rPr>
               <w:object w:dxaOrig="1440" w:dyaOrig="1440" w14:anchorId="56C0B03B">
                 <v:shape id="_x0000_s1029" type="#_x0000_t75" alt="" style="position:absolute;left:0;text-align:left;margin-left:10.8pt;margin-top:6.8pt;width:171.15pt;height:48.9pt;z-index:251654144;mso-wrap-edited:f;mso-width-percent:0;mso-height-percent:0;mso-position-horizontal-relative:text;mso-position-vertical-relative:text;mso-width-percent:0;mso-height-percent:0">
-                  <v:imagedata r:id="rId26" o:title=""/>
+                  <v:imagedata r:id="rId28" o:title=""/>
                 </v:shape>
-                <o:OLEObject Type="Embed" ProgID="Equation.DSMT4" ShapeID="_x0000_s1029" DrawAspect="Content" ObjectID="_1837762187" r:id="rId27"/>
+                <o:OLEObject Type="Embed" ProgID="Equation.DSMT4" ShapeID="_x0000_s1029" DrawAspect="Content" ObjectID="_1837763703" r:id="rId29"/>
               </w:object>
             </w:r>
           </w:p>
@@ -4951,12 +5033,14 @@
                 <w:rFonts w:ascii="Arial" w:hAnsi="Arial" w:cs="Arial"/>
               </w:rPr>
             </w:pPr>
+            <w:proofErr w:type="spellStart"/>
             <w:r>
               <w:rPr>
                 <w:rFonts w:ascii="Arial" w:hAnsi="Arial" w:cs="Arial"/>
               </w:rPr>
               <w:t>VAr</w:t>
             </w:r>
+            <w:proofErr w:type="spellEnd"/>
           </w:p>
         </w:tc>
         <w:tc>
@@ -4987,9 +5071,9 @@
               </w:rPr>
               <w:object w:dxaOrig="1440" w:dyaOrig="1440" w14:anchorId="1FC98C09">
                 <v:shape id="_x0000_s1028" type="#_x0000_t75" alt="" style="position:absolute;left:0;text-align:left;margin-left:16.2pt;margin-top:0;width:115.2pt;height:31.95pt;z-index:251655168;mso-wrap-edited:f;mso-width-percent:0;mso-height-percent:0;mso-width-percent:0;mso-height-percent:0">
-                  <v:imagedata r:id="rId28" o:title=""/>
+                  <v:imagedata r:id="rId30" o:title=""/>
                 </v:shape>
-                <o:OLEObject Type="Embed" ProgID="Equation.DSMT4" ShapeID="_x0000_s1028" DrawAspect="Content" ObjectID="_1837762188" r:id="rId29"/>
+                <o:OLEObject Type="Embed" ProgID="Equation.DSMT4" ShapeID="_x0000_s1028" DrawAspect="Content" ObjectID="_1837763704" r:id="rId31"/>
               </w:object>
             </w:r>
           </w:p>
@@ -5111,7 +5195,7 @@
                     </pic:cNvPicPr>
                   </pic:nvPicPr>
                   <pic:blipFill>
-                    <a:blip r:embed="rId30" cstate="print">
+                    <a:blip r:embed="rId32" cstate="print">
                       <a:extLst>
                         <a:ext uri="{28A0092B-C50C-407E-A947-70E740481C1C}">
                           <a14:useLocalDpi xmlns:a14="http://schemas.microsoft.com/office/drawing/2010/main" val="0"/>
@@ -6915,7 +6999,7 @@
                     </pic:cNvPicPr>
                   </pic:nvPicPr>
                   <pic:blipFill>
-                    <a:blip r:embed="rId31" cstate="print">
+                    <a:blip r:embed="rId33" cstate="print">
                       <a:extLst>
                         <a:ext uri="{28A0092B-C50C-407E-A947-70E740481C1C}">
                           <a14:useLocalDpi xmlns:a14="http://schemas.microsoft.com/office/drawing/2010/main" val="0"/>
@@ -7084,7 +7168,11 @@
         <w:t>voltage</w:t>
       </w:r>
       <w:r>
-        <w:t xml:space="preserve"> (V</w:t>
+        <w:t xml:space="preserve"> (</w:t>
+      </w:r>
+      <w:proofErr w:type="spellStart"/>
+      <w:r>
+        <w:t>V</w:t>
       </w:r>
       <w:r>
         <w:rPr>
@@ -7092,6 +7180,7 @@
         </w:rPr>
         <w:t>p</w:t>
       </w:r>
+      <w:proofErr w:type="spellEnd"/>
       <w:r>
         <w:t>)</w:t>
       </w:r>
@@ -7228,10 +7317,18 @@
         <w:jc w:val="both"/>
       </w:pPr>
       <w:r>
-        <w:t>Transformer Copper Loss (W)</w:t>
-      </w:r>
-      <w:r>
-        <w:t xml:space="preserve">   (hint: associated with R</w:t>
+        <w:t>Transformer Copper Loss (</w:t>
+      </w:r>
+      <w:proofErr w:type="gramStart"/>
+      <w:r>
+        <w:t>W)</w:t>
+      </w:r>
+      <w:r>
+        <w:t xml:space="preserve">   </w:t>
+      </w:r>
+      <w:proofErr w:type="gramEnd"/>
+      <w:r>
+        <w:t>(hint: associated with R</w:t>
       </w:r>
       <w:r>
         <w:rPr>
@@ -7258,10 +7355,22 @@
         <w:jc w:val="both"/>
       </w:pPr>
       <w:r>
-        <w:t>Transformer Iron Loss (W)</w:t>
-      </w:r>
-      <w:r>
-        <w:t xml:space="preserve">  (hint: associated with R</w:t>
+        <w:t>Transformer Iron Loss (</w:t>
+      </w:r>
+      <w:proofErr w:type="gramStart"/>
+      <w:r>
+        <w:t>W)</w:t>
+      </w:r>
+      <w:r>
+        <w:t xml:space="preserve">  (</w:t>
+      </w:r>
+      <w:proofErr w:type="gramEnd"/>
+      <w:r>
+        <w:t xml:space="preserve">hint: associated with </w:t>
+      </w:r>
+      <w:proofErr w:type="spellStart"/>
+      <w:r>
+        <w:t>R</w:t>
       </w:r>
       <w:r>
         <w:rPr>
@@ -7269,6 +7378,7 @@
         </w:rPr>
         <w:t>c</w:t>
       </w:r>
+      <w:proofErr w:type="spellEnd"/>
       <w:r>
         <w:t>)</w:t>
       </w:r>
@@ -7427,7 +7537,16 @@
           <w:sz w:val="20"/>
           <w:szCs w:val="20"/>
         </w:rPr>
-        <w:t xml:space="preserve"> (hint: ignore X</w:t>
+        <w:t xml:space="preserve"> (hint: ignore </w:t>
+      </w:r>
+      <w:proofErr w:type="spellStart"/>
+      <w:r>
+        <w:rPr>
+          <w:rFonts w:ascii="Arial" w:hAnsi="Arial" w:cs="Arial"/>
+          <w:sz w:val="20"/>
+          <w:szCs w:val="20"/>
+        </w:rPr>
+        <w:t>X</w:t>
       </w:r>
       <w:r>
         <w:rPr>
@@ -7438,13 +7557,23 @@
         </w:rPr>
         <w:t>m</w:t>
       </w:r>
+      <w:proofErr w:type="spellEnd"/>
       <w:r>
         <w:rPr>
           <w:rFonts w:ascii="Arial" w:hAnsi="Arial" w:cs="Arial"/>
           <w:sz w:val="20"/>
           <w:szCs w:val="20"/>
         </w:rPr>
-        <w:t xml:space="preserve"> and R</w:t>
+        <w:t xml:space="preserve"> and </w:t>
+      </w:r>
+      <w:proofErr w:type="spellStart"/>
+      <w:r>
+        <w:rPr>
+          <w:rFonts w:ascii="Arial" w:hAnsi="Arial" w:cs="Arial"/>
+          <w:sz w:val="20"/>
+          <w:szCs w:val="20"/>
+        </w:rPr>
+        <w:t>R</w:t>
       </w:r>
       <w:r>
         <w:rPr>
@@ -7455,6 +7584,7 @@
         </w:rPr>
         <w:t>c</w:t>
       </w:r>
+      <w:proofErr w:type="spellEnd"/>
       <w:r>
         <w:rPr>
           <w:rFonts w:ascii="Arial" w:hAnsi="Arial" w:cs="Arial"/>
@@ -7660,9 +7790,9 @@
         </w:rPr>
         <w:object w:dxaOrig="1440" w:dyaOrig="1440" w14:anchorId="60173EEF">
           <v:shape id="_x0000_s1027" type="#_x0000_t75" alt="" style="position:absolute;left:0;text-align:left;margin-left:264.6pt;margin-top:2pt;width:90pt;height:54.7pt;z-index:251663360;mso-wrap-edited:f;mso-width-percent:0;mso-height-percent:0;mso-width-percent:0;mso-height-percent:0">
-            <v:imagedata r:id="rId32" o:title=""/>
+            <v:imagedata r:id="rId34" o:title=""/>
           </v:shape>
-          <o:OLEObject Type="Embed" ProgID="Equation.DSMT4" ShapeID="_x0000_s1027" DrawAspect="Content" ObjectID="_1837762189" r:id="rId33"/>
+          <o:OLEObject Type="Embed" ProgID="Equation.DSMT4" ShapeID="_x0000_s1027" DrawAspect="Content" ObjectID="_1837763705" r:id="rId35"/>
         </w:object>
       </w:r>
       <w:r>
@@ -7674,9 +7804,9 @@
         </w:rPr>
         <w:object w:dxaOrig="1440" w:dyaOrig="1440" w14:anchorId="22765292">
           <v:shape id="_x0000_s1026" type="#_x0000_t75" alt="" style="position:absolute;left:0;text-align:left;margin-left:129.6pt;margin-top:2pt;width:99pt;height:54.8pt;z-index:251662336;mso-wrap-edited:f;mso-width-percent:0;mso-height-percent:0;mso-width-percent:0;mso-height-percent:0">
-            <v:imagedata r:id="rId34" o:title=""/>
+            <v:imagedata r:id="rId36" o:title=""/>
           </v:shape>
-          <o:OLEObject Type="Embed" ProgID="Equation.DSMT4" ShapeID="_x0000_s1026" DrawAspect="Content" ObjectID="_1837762190" r:id="rId35"/>
+          <o:OLEObject Type="Embed" ProgID="Equation.DSMT4" ShapeID="_x0000_s1026" DrawAspect="Content" ObjectID="_1837763706" r:id="rId37"/>
         </w:object>
       </w:r>
     </w:p>
@@ -8537,7 +8667,7 @@
                     <pic:cNvPicPr/>
                   </pic:nvPicPr>
                   <pic:blipFill>
-                    <a:blip r:embed="rId36" cstate="print">
+                    <a:blip r:embed="rId38" cstate="print">
                       <a:extLst>
                         <a:ext uri="{28A0092B-C50C-407E-A947-70E740481C1C}">
                           <a14:useLocalDpi xmlns:a14="http://schemas.microsoft.com/office/drawing/2010/main" val="0"/>
@@ -8621,7 +8751,15 @@
         <w:jc w:val="both"/>
       </w:pPr>
       <w:r>
-        <w:t>We’ll leave the equivalent circuit for the time being and now look at transformer operation with an actual load connected to the secondary winding. Invariably we want the load to dissipate real power so we will represent this with a simple value of resistance. When we investigate transformer performance we are primarily interested in the following:</w:t>
+        <w:t xml:space="preserve">We’ll leave the equivalent circuit for the time being and now look at transformer operation with an actual load connected to the secondary winding. Invariably we want the load to dissipate real power so we will represent this with a simple value of resistance. When we investigate transformer </w:t>
+      </w:r>
+      <w:proofErr w:type="gramStart"/>
+      <w:r>
+        <w:t>performance</w:t>
+      </w:r>
+      <w:proofErr w:type="gramEnd"/>
+      <w:r>
+        <w:t xml:space="preserve"> we are primarily interested in the following:</w:t>
       </w:r>
     </w:p>
     <w:p>
@@ -8995,13 +9133,28 @@
           <w:rFonts w:ascii="Arial" w:hAnsi="Arial" w:cs="Arial"/>
           <w:u w:val="single"/>
         </w:rPr>
-        <w:t>Output Power (W)</w:t>
-      </w:r>
-      <w:r>
-        <w:rPr>
-          <w:rFonts w:ascii="Arial" w:hAnsi="Arial" w:cs="Arial"/>
-        </w:rPr>
-        <w:t xml:space="preserve">     </w:t>
+        <w:t>Output Power (</w:t>
+      </w:r>
+      <w:proofErr w:type="gramStart"/>
+      <w:r>
+        <w:rPr>
+          <w:rFonts w:ascii="Arial" w:hAnsi="Arial" w:cs="Arial"/>
+          <w:u w:val="single"/>
+        </w:rPr>
+        <w:t>W)</w:t>
+      </w:r>
+      <w:r>
+        <w:rPr>
+          <w:rFonts w:ascii="Arial" w:hAnsi="Arial" w:cs="Arial"/>
+        </w:rPr>
+        <w:t xml:space="preserve">   </w:t>
+      </w:r>
+      <w:proofErr w:type="gramEnd"/>
+      <w:r>
+        <w:rPr>
+          <w:rFonts w:ascii="Arial" w:hAnsi="Arial" w:cs="Arial"/>
+        </w:rPr>
+        <w:t xml:space="preserve">  </w:t>
       </w:r>
       <w:r>
         <w:rPr>
@@ -9093,14 +9246,30 @@
           <w:rFonts w:ascii="Arial" w:hAnsi="Arial" w:cs="Arial"/>
           <w:u w:val="single"/>
         </w:rPr>
-        <w:t>Output Power (W)</w:t>
-      </w:r>
+        <w:t>Output Power (</w:t>
+      </w:r>
+      <w:proofErr w:type="gramStart"/>
       <w:r>
         <w:rPr>
           <w:rFonts w:ascii="Arial" w:hAnsi="Arial" w:cs="Arial"/>
           <w:u w:val="single"/>
         </w:rPr>
-        <w:t xml:space="preserve">            </w:t>
+        <w:t>W)</w:t>
+      </w:r>
+      <w:r>
+        <w:rPr>
+          <w:rFonts w:ascii="Arial" w:hAnsi="Arial" w:cs="Arial"/>
+          <w:u w:val="single"/>
+        </w:rPr>
+        <w:t xml:space="preserve">   </w:t>
+      </w:r>
+      <w:proofErr w:type="gramEnd"/>
+      <w:r>
+        <w:rPr>
+          <w:rFonts w:ascii="Arial" w:hAnsi="Arial" w:cs="Arial"/>
+          <w:u w:val="single"/>
+        </w:rPr>
+        <w:t xml:space="preserve">         </w:t>
       </w:r>
       <w:r>
         <w:rPr>
@@ -9160,13 +9329,44 @@
           <w:rFonts w:ascii="Arial" w:hAnsi="Arial" w:cs="Arial"/>
           <w:u w:val="single"/>
         </w:rPr>
-        <w:t>Input Power (W)  -  Losses (W)</w:t>
-      </w:r>
-      <w:r>
-        <w:rPr>
-          <w:rFonts w:ascii="Arial" w:hAnsi="Arial" w:cs="Arial"/>
-        </w:rPr>
-        <w:t xml:space="preserve">     x    100%</w:t>
+        <w:t>Input Power (</w:t>
+      </w:r>
+      <w:proofErr w:type="gramStart"/>
+      <w:r>
+        <w:rPr>
+          <w:rFonts w:ascii="Arial" w:hAnsi="Arial" w:cs="Arial"/>
+          <w:u w:val="single"/>
+        </w:rPr>
+        <w:t>W)  -</w:t>
+      </w:r>
+      <w:proofErr w:type="gramEnd"/>
+      <w:r>
+        <w:rPr>
+          <w:rFonts w:ascii="Arial" w:hAnsi="Arial" w:cs="Arial"/>
+          <w:u w:val="single"/>
+        </w:rPr>
+        <w:t xml:space="preserve">  Losses (</w:t>
+      </w:r>
+      <w:proofErr w:type="gramStart"/>
+      <w:r>
+        <w:rPr>
+          <w:rFonts w:ascii="Arial" w:hAnsi="Arial" w:cs="Arial"/>
+          <w:u w:val="single"/>
+        </w:rPr>
+        <w:t>W)</w:t>
+      </w:r>
+      <w:r>
+        <w:rPr>
+          <w:rFonts w:ascii="Arial" w:hAnsi="Arial" w:cs="Arial"/>
+        </w:rPr>
+        <w:t xml:space="preserve">   </w:t>
+      </w:r>
+      <w:proofErr w:type="gramEnd"/>
+      <w:r>
+        <w:rPr>
+          <w:rFonts w:ascii="Arial" w:hAnsi="Arial" w:cs="Arial"/>
+        </w:rPr>
+        <w:t xml:space="preserve">  x    100%</w:t>
       </w:r>
     </w:p>
     <w:p>
@@ -9207,7 +9407,15 @@
         <w:t>s</w:t>
       </w:r>
       <w:r>
-        <w:t xml:space="preserve"> of the following series of tests is to measure performa</w:t>
+        <w:t xml:space="preserve"> of the following series of tests </w:t>
+      </w:r>
+      <w:proofErr w:type="gramStart"/>
+      <w:r>
+        <w:t>is</w:t>
+      </w:r>
+      <w:proofErr w:type="gramEnd"/>
+      <w:r>
+        <w:t xml:space="preserve"> to measure performa</w:t>
       </w:r>
       <w:r>
         <w:t>nce at four different resistive load points</w:t>
@@ -9647,7 +9855,7 @@
                     </pic:cNvPicPr>
                   </pic:nvPicPr>
                   <pic:blipFill>
-                    <a:blip r:embed="rId37" cstate="print">
+                    <a:blip r:embed="rId39" cstate="print">
                       <a:extLst>
                         <a:ext uri="{28A0092B-C50C-407E-A947-70E740481C1C}">
                           <a14:useLocalDpi xmlns:a14="http://schemas.microsoft.com/office/drawing/2010/main" val="0"/>
@@ -12128,7 +12336,7 @@
                     <pic:cNvPicPr/>
                   </pic:nvPicPr>
                   <pic:blipFill>
-                    <a:blip r:embed="rId38">
+                    <a:blip r:embed="rId40">
                       <a:extLst>
                         <a:ext uri="{28A0092B-C50C-407E-A947-70E740481C1C}">
                           <a14:useLocalDpi xmlns:a14="http://schemas.microsoft.com/office/drawing/2010/main" val="0"/>
@@ -12410,7 +12618,7 @@
                     <pic:cNvPicPr/>
                   </pic:nvPicPr>
                   <pic:blipFill>
-                    <a:blip r:embed="rId39">
+                    <a:blip r:embed="rId41">
                       <a:extLst>
                         <a:ext uri="{28A0092B-C50C-407E-A947-70E740481C1C}">
                           <a14:useLocalDpi xmlns:a14="http://schemas.microsoft.com/office/drawing/2010/main" val="0"/>
@@ -13586,7 +13794,28 @@
         <w:rPr>
           <w:rFonts w:ascii="Arial" w:hAnsi="Arial" w:cs="Arial"/>
         </w:rPr>
-        <w:t>R loss which can be dissipated in the transformer windings as this produces heat which in turn causes a temperature rise in the machine windings. If the winding temperature exceeds the maximum temperature of the winding insulation (eg Class F insulation has T</w:t>
+        <w:t>R loss which can be dissipated in the transformer windings as this produces heat which in turn causes a temperature rise in the machine windings. If the winding temperature exceeds the maximum temperature of the winding insulation (</w:t>
+      </w:r>
+      <w:proofErr w:type="spellStart"/>
+      <w:r>
+        <w:rPr>
+          <w:rFonts w:ascii="Arial" w:hAnsi="Arial" w:cs="Arial"/>
+        </w:rPr>
+        <w:t>eg</w:t>
+      </w:r>
+      <w:proofErr w:type="spellEnd"/>
+      <w:r>
+        <w:rPr>
+          <w:rFonts w:ascii="Arial" w:hAnsi="Arial" w:cs="Arial"/>
+        </w:rPr>
+        <w:t xml:space="preserve"> Class F insulation has </w:t>
+      </w:r>
+      <w:proofErr w:type="spellStart"/>
+      <w:r>
+        <w:rPr>
+          <w:rFonts w:ascii="Arial" w:hAnsi="Arial" w:cs="Arial"/>
+        </w:rPr>
+        <w:t>T</w:t>
       </w:r>
       <w:r>
         <w:rPr>
@@ -13595,6 +13824,7 @@
         </w:rPr>
         <w:t>max</w:t>
       </w:r>
+      <w:proofErr w:type="spellEnd"/>
       <w:r>
         <w:rPr>
           <w:rFonts w:ascii="Arial" w:hAnsi="Arial" w:cs="Arial"/>
@@ -13611,29 +13841,50 @@
         <w:rPr>
           <w:rFonts w:ascii="Arial" w:hAnsi="Arial" w:cs="Arial"/>
         </w:rPr>
-        <w:t>) then the insulation will break down and the windings will be permanently damaged.</w:t>
-      </w:r>
-    </w:p>
-    <w:p>
-      <w:pPr>
-        <w:jc w:val="both"/>
-        <w:rPr>
-          <w:rFonts w:ascii="Arial" w:hAnsi="Arial" w:cs="Arial"/>
-        </w:rPr>
-      </w:pPr>
-    </w:p>
-    <w:p>
-      <w:pPr>
-        <w:jc w:val="both"/>
-        <w:rPr>
-          <w:rFonts w:ascii="Arial" w:hAnsi="Arial" w:cs="Arial"/>
-        </w:rPr>
-      </w:pPr>
-      <w:r>
-        <w:rPr>
-          <w:rFonts w:ascii="Arial" w:hAnsi="Arial" w:cs="Arial"/>
-        </w:rPr>
-        <w:t>The voltage limit is set be the maximum flux density (B</w:t>
+        <w:t xml:space="preserve">) then the insulation will break </w:t>
+      </w:r>
+      <w:proofErr w:type="gramStart"/>
+      <w:r>
+        <w:rPr>
+          <w:rFonts w:ascii="Arial" w:hAnsi="Arial" w:cs="Arial"/>
+        </w:rPr>
+        <w:t>down</w:t>
+      </w:r>
+      <w:proofErr w:type="gramEnd"/>
+      <w:r>
+        <w:rPr>
+          <w:rFonts w:ascii="Arial" w:hAnsi="Arial" w:cs="Arial"/>
+        </w:rPr>
+        <w:t xml:space="preserve"> and the windings will be permanently damaged.</w:t>
+      </w:r>
+    </w:p>
+    <w:p>
+      <w:pPr>
+        <w:jc w:val="both"/>
+        <w:rPr>
+          <w:rFonts w:ascii="Arial" w:hAnsi="Arial" w:cs="Arial"/>
+        </w:rPr>
+      </w:pPr>
+    </w:p>
+    <w:p>
+      <w:pPr>
+        <w:jc w:val="both"/>
+        <w:rPr>
+          <w:rFonts w:ascii="Arial" w:hAnsi="Arial" w:cs="Arial"/>
+        </w:rPr>
+      </w:pPr>
+      <w:r>
+        <w:rPr>
+          <w:rFonts w:ascii="Arial" w:hAnsi="Arial" w:cs="Arial"/>
+        </w:rPr>
+        <w:t>The voltage limit is set be the maximum flux density (</w:t>
+      </w:r>
+      <w:proofErr w:type="spellStart"/>
+      <w:r>
+        <w:rPr>
+          <w:rFonts w:ascii="Arial" w:hAnsi="Arial" w:cs="Arial"/>
+        </w:rPr>
+        <w:t>B</w:t>
       </w:r>
       <w:r>
         <w:rPr>
@@ -13642,6 +13893,7 @@
         </w:rPr>
         <w:t>max</w:t>
       </w:r>
+      <w:proofErr w:type="spellEnd"/>
       <w:r>
         <w:rPr>
           <w:rFonts w:ascii="Arial" w:hAnsi="Arial" w:cs="Arial"/>
@@ -13652,13 +13904,27 @@
         <w:rPr>
           <w:rFonts w:ascii="Arial" w:hAnsi="Arial" w:cs="Arial"/>
         </w:rPr>
-        <w:t>associated wiring</w:t>
-      </w:r>
-      <w:r>
-        <w:rPr>
-          <w:rFonts w:ascii="Arial" w:hAnsi="Arial" w:cs="Arial"/>
-        </w:rPr>
-        <w:t>, and can also distort the supply voltage</w:t>
+        <w:t xml:space="preserve">associated </w:t>
+      </w:r>
+      <w:proofErr w:type="gramStart"/>
+      <w:r>
+        <w:rPr>
+          <w:rFonts w:ascii="Arial" w:hAnsi="Arial" w:cs="Arial"/>
+        </w:rPr>
+        <w:t>wiring</w:t>
+      </w:r>
+      <w:r>
+        <w:rPr>
+          <w:rFonts w:ascii="Arial" w:hAnsi="Arial" w:cs="Arial"/>
+        </w:rPr>
+        <w:t>, and</w:t>
+      </w:r>
+      <w:proofErr w:type="gramEnd"/>
+      <w:r>
+        <w:rPr>
+          <w:rFonts w:ascii="Arial" w:hAnsi="Arial" w:cs="Arial"/>
+        </w:rPr>
+        <w:t xml:space="preserve"> can also distort the supply voltage</w:t>
       </w:r>
       <w:r>
         <w:rPr>
@@ -14193,14 +14459,36 @@
         <w:rPr>
           <w:rFonts w:ascii="Arial" w:hAnsi="Arial" w:cs="Arial"/>
         </w:rPr>
-        <w:t xml:space="preserve">magnetising current and increased losses. We can determine the ‘knee point’ of the BH curve by monitoring the TOTAL HARMONIC DISTORTION (THD) of the primary CURRENT  using the </w:t>
-      </w:r>
+        <w:t xml:space="preserve">magnetising current and increased losses. We can determine the ‘knee point’ of the BH curve by monitoring the TOTAL HARMONIC DISTORTION (THD) of the primary </w:t>
+      </w:r>
+      <w:proofErr w:type="gramStart"/>
+      <w:r>
+        <w:rPr>
+          <w:rFonts w:ascii="Arial" w:hAnsi="Arial" w:cs="Arial"/>
+        </w:rPr>
+        <w:t>CURRENT  using</w:t>
+      </w:r>
+      <w:proofErr w:type="gramEnd"/>
+      <w:r>
+        <w:rPr>
+          <w:rFonts w:ascii="Arial" w:hAnsi="Arial" w:cs="Arial"/>
+        </w:rPr>
+        <w:t xml:space="preserve"> the </w:t>
+      </w:r>
+      <w:proofErr w:type="spellStart"/>
       <w:r>
         <w:rPr>
           <w:rFonts w:ascii="Arial" w:hAnsi="Arial" w:cs="Arial"/>
         </w:rPr>
         <w:lastRenderedPageBreak/>
-        <w:t>Voltech Power Meter. Note that the higher the distortion the higher the value for THD (for an ideal sinusoidal waveform THD = 0%)</w:t>
+        <w:t>Voltech</w:t>
+      </w:r>
+      <w:proofErr w:type="spellEnd"/>
+      <w:r>
+        <w:rPr>
+          <w:rFonts w:ascii="Arial" w:hAnsi="Arial" w:cs="Arial"/>
+        </w:rPr>
+        <w:t xml:space="preserve"> Power Meter. Note that the higher the distortion the higher the value for THD (for an ideal sinusoidal waveform THD = 0%)</w:t>
       </w:r>
     </w:p>
     <w:p>
@@ -14242,7 +14530,7 @@
                     </pic:cNvPicPr>
                   </pic:nvPicPr>
                   <pic:blipFill>
-                    <a:blip r:embed="rId40" cstate="print">
+                    <a:blip r:embed="rId42" cstate="print">
                       <a:extLst>
                         <a:ext uri="{28A0092B-C50C-407E-A947-70E740481C1C}">
                           <a14:useLocalDpi xmlns:a14="http://schemas.microsoft.com/office/drawing/2010/main" val="0"/>
@@ -14420,7 +14708,21 @@
         <w:rPr>
           <w:rFonts w:ascii="Arial" w:hAnsi="Arial" w:cs="Arial"/>
         </w:rPr>
-        <w:t>Ask demonstrator how to set the Voltech Power Meter to measure primary current THD</w:t>
+        <w:t xml:space="preserve">Ask demonstrator how to set the </w:t>
+      </w:r>
+      <w:proofErr w:type="spellStart"/>
+      <w:r>
+        <w:rPr>
+          <w:rFonts w:ascii="Arial" w:hAnsi="Arial" w:cs="Arial"/>
+        </w:rPr>
+        <w:t>Voltech</w:t>
+      </w:r>
+      <w:proofErr w:type="spellEnd"/>
+      <w:r>
+        <w:rPr>
+          <w:rFonts w:ascii="Arial" w:hAnsi="Arial" w:cs="Arial"/>
+        </w:rPr>
+        <w:t xml:space="preserve"> Power Meter to measure primary current THD</w:t>
       </w:r>
     </w:p>
     <w:p>
@@ -14547,7 +14849,25 @@
                 <w:sz w:val="28"/>
                 <w:szCs w:val="28"/>
               </w:rPr>
-              <w:t xml:space="preserve">Primary Current (A)            </w:t>
+              <w:t>Primary Current (</w:t>
+            </w:r>
+            <w:proofErr w:type="gramStart"/>
+            <w:r>
+              <w:rPr>
+                <w:rFonts w:ascii="Arial" w:hAnsi="Arial" w:cs="Arial"/>
+                <w:sz w:val="28"/>
+                <w:szCs w:val="28"/>
+              </w:rPr>
+              <w:t xml:space="preserve">A)   </w:t>
+            </w:r>
+            <w:proofErr w:type="gramEnd"/>
+            <w:r>
+              <w:rPr>
+                <w:rFonts w:ascii="Arial" w:hAnsi="Arial" w:cs="Arial"/>
+                <w:sz w:val="28"/>
+                <w:szCs w:val="28"/>
+              </w:rPr>
+              <w:t xml:space="preserve">         </w:t>
             </w:r>
           </w:p>
         </w:tc>
@@ -14571,7 +14891,25 @@
                 <w:sz w:val="28"/>
                 <w:szCs w:val="28"/>
               </w:rPr>
-              <w:t xml:space="preserve">Primary Current THD   (%)              </w:t>
+              <w:t>Primary Current THD</w:t>
+            </w:r>
+            <w:proofErr w:type="gramStart"/>
+            <w:r>
+              <w:rPr>
+                <w:rFonts w:ascii="Arial" w:hAnsi="Arial" w:cs="Arial"/>
+                <w:sz w:val="28"/>
+                <w:szCs w:val="28"/>
+              </w:rPr>
+              <w:t xml:space="preserve">   (%)   </w:t>
+            </w:r>
+            <w:proofErr w:type="gramEnd"/>
+            <w:r>
+              <w:rPr>
+                <w:rFonts w:ascii="Arial" w:hAnsi="Arial" w:cs="Arial"/>
+                <w:sz w:val="28"/>
+                <w:szCs w:val="28"/>
+              </w:rPr>
+              <w:t xml:space="preserve">           </w:t>
             </w:r>
           </w:p>
         </w:tc>
@@ -15812,7 +16150,7 @@
           <w:noProof/>
         </w:rPr>
         <w:drawing>
-          <wp:inline distT="0" distB="0" distL="0" distR="0" wp14:anchorId="52A27EA7" wp14:editId="6F9FB4E8">
+          <wp:inline distT="0" distB="0" distL="0" distR="0" wp14:anchorId="52A27EA7" wp14:editId="4E0D2F78">
             <wp:extent cx="5842000" cy="4381500"/>
             <wp:effectExtent l="12700" t="12700" r="12700" b="12700"/>
             <wp:docPr id="1727474016" name="Picture 9" descr="A graph with lines and dots&#10;&#10;AI-generated content may be incorrect."/>
@@ -15827,7 +16165,7 @@
                     <pic:cNvPicPr/>
                   </pic:nvPicPr>
                   <pic:blipFill>
-                    <a:blip r:embed="rId41" cstate="print">
+                    <a:blip r:embed="rId43" cstate="print">
                       <a:extLst>
                         <a:ext uri="{28A0092B-C50C-407E-A947-70E740481C1C}">
                           <a14:useLocalDpi xmlns:a14="http://schemas.microsoft.com/office/drawing/2010/main" val="0"/>
@@ -15901,7 +16239,7 @@
                     <pic:cNvPicPr/>
                   </pic:nvPicPr>
                   <pic:blipFill>
-                    <a:blip r:embed="rId42" cstate="print">
+                    <a:blip r:embed="rId44" cstate="print">
                       <a:extLst>
                         <a:ext uri="{28A0092B-C50C-407E-A947-70E740481C1C}">
                           <a14:useLocalDpi xmlns:a14="http://schemas.microsoft.com/office/drawing/2010/main" val="0"/>
@@ -16047,7 +16385,21 @@
           <w:rFonts w:ascii="Arial" w:hAnsi="Arial" w:cs="Arial"/>
         </w:rPr>
         <w:lastRenderedPageBreak/>
-        <w:t xml:space="preserve">The corresponding Flux Density (Bmax) at this knee point can be calculated </w:t>
+        <w:t>The corresponding Flux Density (</w:t>
+      </w:r>
+      <w:proofErr w:type="spellStart"/>
+      <w:r>
+        <w:rPr>
+          <w:rFonts w:ascii="Arial" w:hAnsi="Arial" w:cs="Arial"/>
+        </w:rPr>
+        <w:t>Bmax</w:t>
+      </w:r>
+      <w:proofErr w:type="spellEnd"/>
+      <w:r>
+        <w:rPr>
+          <w:rFonts w:ascii="Arial" w:hAnsi="Arial" w:cs="Arial"/>
+        </w:rPr>
+        <w:t xml:space="preserve">) at this knee point can be calculated </w:t>
       </w:r>
       <w:r>
         <w:rPr>
@@ -16126,6 +16478,7 @@
                 <w:rFonts w:ascii="Arial" w:hAnsi="Arial" w:cs="Arial"/>
               </w:rPr>
             </w:pPr>
+            <w:proofErr w:type="spellStart"/>
             <w:r>
               <w:rPr>
                 <w:rFonts w:ascii="Arial" w:hAnsi="Arial" w:cs="Arial"/>
@@ -16139,11 +16492,19 @@
               </w:rPr>
               <w:t>p</w:t>
             </w:r>
-            <w:r>
-              <w:rPr>
-                <w:rFonts w:ascii="Arial" w:hAnsi="Arial" w:cs="Arial"/>
-              </w:rPr>
-              <w:t xml:space="preserve"> = √2.π.f.N</w:t>
+            <w:proofErr w:type="spellEnd"/>
+            <w:r>
+              <w:rPr>
+                <w:rFonts w:ascii="Arial" w:hAnsi="Arial" w:cs="Arial"/>
+              </w:rPr>
+              <w:t xml:space="preserve"> = √2.π.</w:t>
+            </w:r>
+            <w:proofErr w:type="gramStart"/>
+            <w:r>
+              <w:rPr>
+                <w:rFonts w:ascii="Arial" w:hAnsi="Arial" w:cs="Arial"/>
+              </w:rPr>
+              <w:t>f.N</w:t>
             </w:r>
             <w:r>
               <w:rPr>
@@ -16171,6 +16532,7 @@
               </w:rPr>
               <w:t>C</w:t>
             </w:r>
+            <w:proofErr w:type="gramEnd"/>
           </w:p>
           <w:p>
             <w:pPr>
@@ -16202,6 +16564,7 @@
                 <w:rFonts w:ascii="Arial" w:hAnsi="Arial" w:cs="Arial"/>
               </w:rPr>
             </w:pPr>
+            <w:proofErr w:type="spellStart"/>
             <w:r>
               <w:rPr>
                 <w:rFonts w:ascii="Arial" w:hAnsi="Arial" w:cs="Arial"/>
@@ -16215,6 +16578,7 @@
               </w:rPr>
               <w:t>p</w:t>
             </w:r>
+            <w:proofErr w:type="spellEnd"/>
             <w:r>
               <w:rPr>
                 <w:rFonts w:ascii="Arial" w:hAnsi="Arial" w:cs="Arial"/>
@@ -16512,12 +16876,14 @@
                 <w:rFonts w:ascii="Arial" w:hAnsi="Arial" w:cs="Arial"/>
               </w:rPr>
             </w:pPr>
+            <w:proofErr w:type="spellStart"/>
             <w:r>
               <w:rPr>
                 <w:rFonts w:ascii="Arial" w:hAnsi="Arial" w:cs="Arial"/>
               </w:rPr>
               <w:t>Vp</w:t>
             </w:r>
+            <w:proofErr w:type="spellEnd"/>
           </w:p>
         </w:tc>
         <w:tc>
@@ -16595,7 +16961,14 @@
               <w:rPr>
                 <w:rFonts w:ascii="Arial" w:hAnsi="Arial" w:cs="Arial"/>
               </w:rPr>
-              <w:t>Calculated B</w:t>
+              <w:t xml:space="preserve">Calculated </w:t>
+            </w:r>
+            <w:proofErr w:type="spellStart"/>
+            <w:r>
+              <w:rPr>
+                <w:rFonts w:ascii="Arial" w:hAnsi="Arial" w:cs="Arial"/>
+              </w:rPr>
+              <w:t>B</w:t>
             </w:r>
             <w:r>
               <w:rPr>
@@ -16604,6 +16977,7 @@
               </w:rPr>
               <w:t>max</w:t>
             </w:r>
+            <w:proofErr w:type="spellEnd"/>
           </w:p>
         </w:tc>
         <w:tc>
@@ -16689,11 +17063,19 @@
           <w:rFonts w:ascii="Arial" w:hAnsi="Arial" w:cs="Arial"/>
         </w:rPr>
       </w:pPr>
-      <w:r>
-        <w:rPr>
-          <w:rFonts w:ascii="Arial" w:hAnsi="Arial" w:cs="Arial"/>
-        </w:rPr>
-        <w:t>Again it would be worthwhile looking up relevant literature to confirm this calculation.</w:t>
+      <w:proofErr w:type="gramStart"/>
+      <w:r>
+        <w:rPr>
+          <w:rFonts w:ascii="Arial" w:hAnsi="Arial" w:cs="Arial"/>
+        </w:rPr>
+        <w:t>Again</w:t>
+      </w:r>
+      <w:proofErr w:type="gramEnd"/>
+      <w:r>
+        <w:rPr>
+          <w:rFonts w:ascii="Arial" w:hAnsi="Arial" w:cs="Arial"/>
+        </w:rPr>
+        <w:t xml:space="preserve"> it would be worthwhile looking up relevant literature to confirm this calculation.</w:t>
       </w:r>
     </w:p>
     <w:p>
@@ -16772,6 +17154,44 @@
     </w:sectPr>
   </w:body>
 </w:document>
+</file>
+
+<file path=word/endnotes.xml><?xml version="1.0" encoding="utf-8"?>
+<w:endnotes xmlns:wpc="http://schemas.microsoft.com/office/word/2010/wordprocessingCanvas" xmlns:cx="http://schemas.microsoft.com/office/drawing/2014/chartex" xmlns:cx1="http://schemas.microsoft.com/office/drawing/2015/9/8/chartex" xmlns:cx2="http://schemas.microsoft.com/office/drawing/2015/10/21/chartex" xmlns:cx3="http://schemas.microsoft.com/office/drawing/2016/5/9/chartex" xmlns:cx4="http://schemas.microsoft.com/office/drawing/2016/5/10/chartex" xmlns:cx5="http://schemas.microsoft.com/office/drawing/2016/5/11/chartex" xmlns:cx6="http://schemas.microsoft.com/office/drawing/2016/5/12/chartex" xmlns:cx7="http://schemas.microsoft.com/office/drawing/2016/5/13/chartex" xmlns:cx8="http://schemas.microsoft.com/office/drawing/2016/5/14/chartex" xmlns:mc="http://schemas.openxmlformats.org/markup-compatibility/2006" xmlns:aink="http://schemas.microsoft.com/office/drawing/2016/ink" xmlns:am3d="http://schemas.microsoft.com/office/drawing/2017/model3d" xmlns:o="urn:schemas-microsoft-com:office:office" xmlns:oel="http://schemas.microsoft.com/office/2019/extlst" xmlns:r="http://schemas.openxmlformats.org/officeDocument/2006/relationships" xmlns:m="http://schemas.openxmlformats.org/officeDocument/2006/math" xmlns:v="urn:schemas-microsoft-com:vml" xmlns:wp14="http://schemas.microsoft.com/office/word/2010/wordprocessingDrawing" xmlns:wp="http://schemas.openxmlformats.org/drawingml/2006/wordprocessingDrawing" xmlns:w10="urn:schemas-microsoft-com:office:word" xmlns:w="http://schemas.openxmlformats.org/wordprocessingml/2006/main" xmlns:w14="http://schemas.microsoft.com/office/word/2010/wordml" xmlns:w15="http://schemas.microsoft.com/office/word/2012/wordml" xmlns:w16cex="http://schemas.microsoft.com/office/word/2018/wordml/cex" xmlns:w16cid="http://schemas.microsoft.com/office/word/2016/wordml/cid" xmlns:w16="http://schemas.microsoft.com/office/word/2018/wordml" xmlns:w16du="http://schemas.microsoft.com/office/word/2023/wordml/word16du" xmlns:w16sdtdh="http://schemas.microsoft.com/office/word/2020/wordml/sdtdatahash" xmlns:w16sdtfl="http://schemas.microsoft.com/office/word/2024/wordml/sdtformatlock" xmlns:w16se="http://schemas.microsoft.com/office/word/2015/wordml/symex" xmlns:wpg="http://schemas.microsoft.com/office/word/2010/wordprocessingGroup" xmlns:wpi="http://schemas.microsoft.com/office/word/2010/wordprocessingInk" xmlns:wne="http://schemas.microsoft.com/office/word/2006/wordml" xmlns:wps="http://schemas.microsoft.com/office/word/2010/wordprocessingShape" mc:Ignorable="w14 w15 w16se w16cid w16 w16cex w16sdtdh w16sdtfl w16du wp14">
+  <w:endnote w:type="separator" w:id="-1">
+    <w:p>
+      <w:r>
+        <w:separator/>
+      </w:r>
+    </w:p>
+  </w:endnote>
+  <w:endnote w:type="continuationSeparator" w:id="0">
+    <w:p>
+      <w:r>
+        <w:continuationSeparator/>
+      </w:r>
+    </w:p>
+  </w:endnote>
+</w:endnotes>
+</file>
+
+<file path=word/footnotes.xml><?xml version="1.0" encoding="utf-8"?>
+<w:footnotes xmlns:wpc="http://schemas.microsoft.com/office/word/2010/wordprocessingCanvas" xmlns:cx="http://schemas.microsoft.com/office/drawing/2014/chartex" xmlns:cx1="http://schemas.microsoft.com/office/drawing/2015/9/8/chartex" xmlns:cx2="http://schemas.microsoft.com/office/drawing/2015/10/21/chartex" xmlns:cx3="http://schemas.microsoft.com/office/drawing/2016/5/9/chartex" xmlns:cx4="http://schemas.microsoft.com/office/drawing/2016/5/10/chartex" xmlns:cx5="http://schemas.microsoft.com/office/drawing/2016/5/11/chartex" xmlns:cx6="http://schemas.microsoft.com/office/drawing/2016/5/12/chartex" xmlns:cx7="http://schemas.microsoft.com/office/drawing/2016/5/13/chartex" xmlns:cx8="http://schemas.microsoft.com/office/drawing/2016/5/14/chartex" xmlns:mc="http://schemas.openxmlformats.org/markup-compatibility/2006" xmlns:aink="http://schemas.microsoft.com/office/drawing/2016/ink" xmlns:am3d="http://schemas.microsoft.com/office/drawing/2017/model3d" xmlns:o="urn:schemas-microsoft-com:office:office" xmlns:oel="http://schemas.microsoft.com/office/2019/extlst" xmlns:r="http://schemas.openxmlformats.org/officeDocument/2006/relationships" xmlns:m="http://schemas.openxmlformats.org/officeDocument/2006/math" xmlns:v="urn:schemas-microsoft-com:vml" xmlns:wp14="http://schemas.microsoft.com/office/word/2010/wordprocessingDrawing" xmlns:wp="http://schemas.openxmlformats.org/drawingml/2006/wordprocessingDrawing" xmlns:w10="urn:schemas-microsoft-com:office:word" xmlns:w="http://schemas.openxmlformats.org/wordprocessingml/2006/main" xmlns:w14="http://schemas.microsoft.com/office/word/2010/wordml" xmlns:w15="http://schemas.microsoft.com/office/word/2012/wordml" xmlns:w16cex="http://schemas.microsoft.com/office/word/2018/wordml/cex" xmlns:w16cid="http://schemas.microsoft.com/office/word/2016/wordml/cid" xmlns:w16="http://schemas.microsoft.com/office/word/2018/wordml" xmlns:w16du="http://schemas.microsoft.com/office/word/2023/wordml/word16du" xmlns:w16sdtdh="http://schemas.microsoft.com/office/word/2020/wordml/sdtdatahash" xmlns:w16sdtfl="http://schemas.microsoft.com/office/word/2024/wordml/sdtformatlock" xmlns:w16se="http://schemas.microsoft.com/office/word/2015/wordml/symex" xmlns:wpg="http://schemas.microsoft.com/office/word/2010/wordprocessingGroup" xmlns:wpi="http://schemas.microsoft.com/office/word/2010/wordprocessingInk" xmlns:wne="http://schemas.microsoft.com/office/word/2006/wordml" xmlns:wps="http://schemas.microsoft.com/office/word/2010/wordprocessingShape" mc:Ignorable="w14 w15 w16se w16cid w16 w16cex w16sdtdh w16sdtfl w16du wp14">
+  <w:footnote w:type="separator" w:id="-1">
+    <w:p>
+      <w:r>
+        <w:separator/>
+      </w:r>
+    </w:p>
+  </w:footnote>
+  <w:footnote w:type="continuationSeparator" w:id="0">
+    <w:p>
+      <w:r>
+        <w:continuationSeparator/>
+      </w:r>
+    </w:p>
+  </w:footnote>
+</w:footnotes>
 </file>
 
 <file path=word/numbering.xml><?xml version="1.0" encoding="utf-8"?>
@@ -18711,6 +19131,50 @@
       </w:tblBorders>
     </w:tblPr>
   </w:style>
+  <w:style w:type="paragraph" w:styleId="Header">
+    <w:name w:val="header"/>
+    <w:basedOn w:val="Normal"/>
+    <w:link w:val="HeaderChar"/>
+    <w:rsid w:val="00714F96"/>
+    <w:pPr>
+      <w:tabs>
+        <w:tab w:val="center" w:pos="4680"/>
+        <w:tab w:val="right" w:pos="9360"/>
+      </w:tabs>
+    </w:pPr>
+  </w:style>
+  <w:style w:type="character" w:customStyle="1" w:styleId="HeaderChar">
+    <w:name w:val="Header Char"/>
+    <w:basedOn w:val="DefaultParagraphFont"/>
+    <w:link w:val="Header"/>
+    <w:rsid w:val="00714F96"/>
+    <w:rPr>
+      <w:sz w:val="24"/>
+      <w:szCs w:val="24"/>
+    </w:rPr>
+  </w:style>
+  <w:style w:type="paragraph" w:styleId="Footer">
+    <w:name w:val="footer"/>
+    <w:basedOn w:val="Normal"/>
+    <w:link w:val="FooterChar"/>
+    <w:rsid w:val="00714F96"/>
+    <w:pPr>
+      <w:tabs>
+        <w:tab w:val="center" w:pos="4680"/>
+        <w:tab w:val="right" w:pos="9360"/>
+      </w:tabs>
+    </w:pPr>
+  </w:style>
+  <w:style w:type="character" w:customStyle="1" w:styleId="FooterChar">
+    <w:name w:val="Footer Char"/>
+    <w:basedOn w:val="DefaultParagraphFont"/>
+    <w:link w:val="Footer"/>
+    <w:rsid w:val="00714F96"/>
+    <w:rPr>
+      <w:sz w:val="24"/>
+      <w:szCs w:val="24"/>
+    </w:rPr>
+  </w:style>
 </w:styles>
 </file>
 

</xml_diff>